<commit_message>
release: data-pack v1.0.1 — collision-check renames, canon promoted, co-002 product defined
15 flagged entities renamed across canon, specs, artifacts, generators,
datasets, and rebuilt DOCX (people names untouched; Kestrel/Ashgrove
phrase-scoped). validate now handles mapping-shaped planted features.

Co-Authored-By: Claude Fable 5 <noreply@anthropic.com>
Claude-Session: https://claude.ai/code/session_01SGQ4HhQK6XtEFiFWK4NDMw
</commit_message>
<xml_diff>
--- a/artifacts/LGL-02/build/mutual-nda-qa-broken.docx
+++ b/artifacts/LGL-02/build/mutual-nda-qa-broken.docx
@@ -81,7 +81,7 @@
           <w:b/>
           <w:bCs/>
         </w:rPr>
-        <w:t xml:space="preserve">Veranda Labs, Inc.</w:t>
+        <w:t xml:space="preserve">Palisade Labs, Inc.</w:t>
       </w:r>
       <w:r>
         <w:t xml:space="preserve">, a Delaware corporation with its principal place of business at 3600 Wexler Point, Building 4, San Mateo, California 94402.</w:t>
@@ -1037,7 +1037,7 @@
           <w:b/>
           <w:bCs/>
         </w:rPr>
-        <w:t xml:space="preserve">If to Veranda Labs, Inc.:</w:t>
+        <w:t xml:space="preserve">If to Palisade Labs, Inc.:</w:t>
       </w:r>
       <w:r>
         <w:t xml:space="preserve"> </w:t>

</xml_diff>